<commit_message>
feat(thesis): propagar Anexo J, bibliografia [40]-[46] y Anexo K a los tres .docx (§F190)
Cierra 5 dias de deuda de propagacion (§F168/§F169) mas la del mismo dia
(§F188). docx_replace_terms.py no sirve para insertar parrafos/tablas nuevas
(solo sustituye texto existente), asi que se escribio un script de migracion
que extrae los estilos reales de cada uno de los tres .docx (que difieren
entre si) desde su propia seccion Anexo I ya existente, y construye con ellos
el contenido nuevo. Verificado sobre copias antes de aplicar in situ:
integridad de ZIP, buena formacion de XML, comprobaciones de prosa/tablas/
encabezados del propio verificador. Respaldo previo de los tres .docx.

Verificador: de 81 fallos (63 declarados) a 30 fallos (30 declarados), 0
nuevos. Retiradas 17 declaraciones de FALLOS_DECLARADOS sin nada que tapar.

Co-Authored-By: Claude Sonnet 5 <noreply@anthropic.com>
</commit_message>
<xml_diff>
--- a/Informe_Final_Tesina_NER.docx
+++ b/Informe_Final_Tesina_NER.docx
@@ -12583,6 +12583,153 @@
           <w:ilvl w:val="0"/>
           <w:numId w:val="0"/>
         </w:numPr>
+        <w:pStyle w:val="BodyText"/>
+      </w:pPr>
+      <w:r>
+        <w:t xml:space="preserve">[40] K. Pearson, "Note on Regression and Inheritance in the Case of Two Parents," </w:t>
+      </w:r>
+      <w:r>
+        <w:rPr>
+          <w:i/>
+        </w:rPr>
+        <w:t xml:space="preserve">Proceedings of the Royal Society of London</w:t>
+      </w:r>
+      <w:r>
+        <w:t xml:space="preserve">, vol. 58, pp. 240-242, 1895. [En línea]. Disponible: https://doi.org/10.1098/rspl.1895.0041</w:t>
+      </w:r>
+    </w:p>
+    <w:p>
+      <w:pPr>
+        <w:numPr>
+          <w:ilvl w:val="0"/>
+          <w:numId w:val="0"/>
+        </w:numPr>
+        <w:pStyle w:val="BodyText"/>
+      </w:pPr>
+      <w:r>
+        <w:t xml:space="preserve">[41] C. Spearman, "The Proof and Measurement of Association Between Two Things," </w:t>
+      </w:r>
+      <w:r>
+        <w:rPr>
+          <w:i/>
+        </w:rPr>
+        <w:t xml:space="preserve">American Journal of Psychology</w:t>
+      </w:r>
+      <w:r>
+        <w:t xml:space="preserve">, vol. 15, no. 1, pp. 72-101, 1904. [En línea]. Disponible: https://doi.org/10.2307/1412159</w:t>
+      </w:r>
+    </w:p>
+    <w:p>
+      <w:pPr>
+        <w:numPr>
+          <w:ilvl w:val="0"/>
+          <w:numId w:val="0"/>
+        </w:numPr>
+        <w:pStyle w:val="BodyText"/>
+      </w:pPr>
+      <w:r>
+        <w:t xml:space="preserve">[42] R. A. Fisher, </w:t>
+      </w:r>
+      <w:r>
+        <w:rPr>
+          <w:i/>
+        </w:rPr>
+        <w:t xml:space="preserve">Statistical Methods for Research Workers</w:t>
+      </w:r>
+      <w:r>
+        <w:t xml:space="preserve">. Edimburgo: Oliver &amp; Boyd, 1925. [En línea]. Disponible: https://openlibrary.org/works/OL1153861W</w:t>
+      </w:r>
+    </w:p>
+    <w:p>
+      <w:pPr>
+        <w:numPr>
+          <w:ilvl w:val="0"/>
+          <w:numId w:val="0"/>
+        </w:numPr>
+        <w:pStyle w:val="BodyText"/>
+      </w:pPr>
+      <w:r>
+        <w:t xml:space="preserve">[43] M. Friedman, "The Use of Ranks to Avoid the Assumption of Normality Implicit in the Analysis of Variance," </w:t>
+      </w:r>
+      <w:r>
+        <w:rPr>
+          <w:i/>
+        </w:rPr>
+        <w:t xml:space="preserve">Journal of the American Statistical Association</w:t>
+      </w:r>
+      <w:r>
+        <w:t xml:space="preserve">, vol. 32, no. 200, pp. 675-701, 1937. [En línea]. Disponible: https://doi.org/10.1080/01621459.1937.10503522</w:t>
+      </w:r>
+    </w:p>
+    <w:p>
+      <w:pPr>
+        <w:numPr>
+          <w:ilvl w:val="0"/>
+          <w:numId w:val="0"/>
+        </w:numPr>
+        <w:pStyle w:val="BodyText"/>
+      </w:pPr>
+      <w:r>
+        <w:t xml:space="preserve">[44] H. Levene, "Robust Tests for Equality of Variances," in </w:t>
+      </w:r>
+      <w:r>
+        <w:rPr>
+          <w:i/>
+        </w:rPr>
+        <w:t xml:space="preserve">Contributions to Probability and Statistics: Essays in Honor of Harold Hotelling</w:t>
+      </w:r>
+      <w:r>
+        <w:t xml:space="preserve">, I. Olkin, Ed. Stanford, CA: Stanford University Press, 1960, pp. 278-292. [En línea]. Disponible: https://openlibrary.org/books/OL5793803M</w:t>
+      </w:r>
+    </w:p>
+    <w:p>
+      <w:pPr>
+        <w:numPr>
+          <w:ilvl w:val="0"/>
+          <w:numId w:val="0"/>
+        </w:numPr>
+        <w:pStyle w:val="BodyText"/>
+      </w:pPr>
+      <w:r>
+        <w:t xml:space="preserve">[45] M. B. Brown and A. B. Forsythe, "Robust Tests for the Equality of Variances," </w:t>
+      </w:r>
+      <w:r>
+        <w:rPr>
+          <w:i/>
+        </w:rPr>
+        <w:t xml:space="preserve">Journal of the American Statistical Association</w:t>
+      </w:r>
+      <w:r>
+        <w:t xml:space="preserve">, vol. 69, no. 346, pp. 364-367, 1974. [En línea]. Disponible: https://doi.org/10.1080/01621459.1974.10482955</w:t>
+      </w:r>
+    </w:p>
+    <w:p>
+      <w:pPr>
+        <w:numPr>
+          <w:ilvl w:val="0"/>
+          <w:numId w:val="0"/>
+        </w:numPr>
+        <w:pStyle w:val="BodyText"/>
+      </w:pPr>
+      <w:r>
+        <w:t xml:space="preserve">[46] J. Cohen, </w:t>
+      </w:r>
+      <w:r>
+        <w:rPr>
+          <w:i/>
+        </w:rPr>
+        <w:t xml:space="preserve">Statistical Power Analysis for the Behavioral Sciences</w:t>
+      </w:r>
+      <w:r>
+        <w:t xml:space="preserve">, 2.ª ed. Hillsdale, NJ: Lawrence Erlbaum Associates, 1988. [En línea]. Disponible: https://openlibrary.org/books/OL2035961M</w:t>
+      </w:r>
+    </w:p>
+    <w:p>
+      <w:pPr>
+        <w:numPr>
+          <w:ilvl w:val="0"/>
+          <w:numId w:val="0"/>
+        </w:numPr>
         <w:pStyle w:val="Heading1"/>
       </w:pPr>
       <w:r>
@@ -25944,6 +26091,1817 @@
       </w:r>
       <w:r>
         <w:t>, por encima incluso de esta estimación restringida: era conservadora, no optimista.</w:t>
+      </w:r>
+    </w:p>
+    <w:p>
+      <w:pPr>
+        <w:numPr>
+          <w:ilvl w:val="0"/>
+          <w:numId w:val="0"/>
+        </w:numPr>
+        <w:pStyle w:val="Heading2"/>
+      </w:pPr>
+      <w:r>
+        <w:t>Anexo J — Correlación entre capacidad y beneficio del RAG: fuente y reproducción</w:t>
+      </w:r>
+    </w:p>
+    <w:p>
+      <w:pPr>
+        <w:numPr>
+          <w:ilvl w:val="0"/>
+          <w:numId w:val="0"/>
+        </w:numPr>
+        <w:pStyle w:val="BodyText"/>
+      </w:pPr>
+      <w:r>
+        <w:t xml:space="preserve">Las dos cifras de §5.3.1 sobre la relación entre el desempeño base de un modelo y la mejora que le aporta el KB RAG —Spearman −0,0879 (p = 0,7752) y Pearson −0,4816 (p = 0,0956), sobre los N=13 pares (F1 base, ΔF1) de la Tabla 7— proceden de tools/robustez_estadistica.py, que las calcula con scipy.stats.pearsonr y scipy.stats.spearmanr sobre el CSV consolidado de la re-corrida adoptada y las persiste en repos/ner-llm-entity-benchmark/results/ROBUSTEZ_ESTADISTICA_20260909_FIX/robustez.json. El coeficiente de </w:t>
+      </w:r>
+      <w:r>
+        <w:rPr>
+          <w:b/>
+        </w:rPr>
+        <w:t xml:space="preserve">Pearson</w:t>
+      </w:r>
+      <w:r>
+        <w:t xml:space="preserve"> [40] mide la asociación lineal entre las dos variables y es sensible a los valores atípicos; el de </w:t>
+      </w:r>
+      <w:r>
+        <w:rPr>
+          <w:b/>
+        </w:rPr>
+        <w:t xml:space="preserve">Spearman</w:t>
+      </w:r>
+      <w:r>
+        <w:t xml:space="preserve"> [41], calculado sobre sus rangos y no sobre los valores, capta cualquier relación monótona sin asumir linealidad, a costa de ignorar la magnitud de la asociación. Ninguno de los dos alcanza el 5 % de significancia sobre los trece modelos.</w:t>
+      </w:r>
+    </w:p>
+    <w:p>
+      <w:pPr>
+        <w:numPr>
+          <w:ilvl w:val="0"/>
+          <w:numId w:val="0"/>
+        </w:numPr>
+        <w:pStyle w:val="BodyText"/>
+      </w:pPr>
+      <w:r>
+        <w:t xml:space="preserve">La Tabla 20 recalcula ambos coeficientes retirando, uno a la vez, cada uno de los trece modelos de la muestra, para identificar cuánto depende el resultado de un único caso. Solo la ausencia de nemotron-mini:4b cambia el signo y la significancia del coeficiente de Pearson; las otras doce retiradas lo dejan entre −0,47 y −0,62, con el mismo signo que sobre la muestra completa.</w:t>
+      </w:r>
+    </w:p>
+    <w:p>
+      <w:pPr>
+        <w:numPr>
+          <w:ilvl w:val="0"/>
+          <w:numId w:val="0"/>
+        </w:numPr>
+        <w:pStyle w:val="TableCaption"/>
+      </w:pPr>
+      <w:r>
+        <w:t>Tabla 20. Sensibilidad de la correlación capacidad-beneficio a la retirada de cada modelo (N=12 restantes por fila)</w:t>
+      </w:r>
+    </w:p>
+    <w:tbl>
+      <w:tblPr>
+        <w:tblStyle w:val="Table"/>
+        <w:tblW w:type="pct" w:w="5000"/>
+        <w:tblLayout w:type="fixed"/>
+        <w:tblLook w:firstRow="1" w:lastRow="0" w:firstColumn="0" w:lastColumn="0" w:noHBand="0" w:noVBand="0" w:val="0020"/>
+      </w:tblPr>
+      <w:tblGrid>
+        <w:gridCol w:w="2600"/>
+        <w:gridCol w:w="2079"/>
+        <w:gridCol w:w="2079"/>
+        <w:gridCol w:w="2080"/>
+      </w:tblGrid>
+      <w:tr>
+        <w:trPr>
+          <w:tblHeader w:val="on"/>
+        </w:trPr>
+        <w:tc>
+          <w:tcPr>
+            <w:tcW w:type="dxa" w:w="2600"/>
+          </w:tcPr>
+          <w:p>
+            <w:pPr>
+              <w:pStyle w:val="Compact"/>
+              <w:jc w:val="left"/>
+            </w:pPr>
+            <w:r>
+              <w:rPr>
+                <w:b/>
+              </w:rPr>
+              <w:t>Modelo retirado</w:t>
+            </w:r>
+          </w:p>
+        </w:tc>
+        <w:tc>
+          <w:tcPr>
+            <w:tcW w:type="dxa" w:w="2079"/>
+          </w:tcPr>
+          <w:p>
+            <w:pPr>
+              <w:pStyle w:val="Compact"/>
+              <w:jc w:val="center"/>
+            </w:pPr>
+            <w:r>
+              <w:rPr>
+                <w:b/>
+              </w:rPr>
+              <w:t>Pearson r</w:t>
+            </w:r>
+          </w:p>
+        </w:tc>
+        <w:tc>
+          <w:tcPr>
+            <w:tcW w:type="dxa" w:w="2079"/>
+          </w:tcPr>
+          <w:p>
+            <w:pPr>
+              <w:pStyle w:val="Compact"/>
+              <w:jc w:val="center"/>
+            </w:pPr>
+            <w:r>
+              <w:rPr>
+                <w:b/>
+              </w:rPr>
+              <w:t>Pearson p</w:t>
+            </w:r>
+          </w:p>
+        </w:tc>
+        <w:tc>
+          <w:tcPr>
+            <w:tcW w:type="dxa" w:w="2080"/>
+          </w:tcPr>
+          <w:p>
+            <w:pPr>
+              <w:pStyle w:val="Compact"/>
+              <w:jc w:val="center"/>
+            </w:pPr>
+            <w:r>
+              <w:rPr>
+                <w:b/>
+              </w:rPr>
+              <w:t>Spearman ρ</w:t>
+            </w:r>
+          </w:p>
+        </w:tc>
+      </w:tr>
+      <w:tr>
+        <w:tc>
+          <w:tcPr>
+            <w:tcW w:type="dxa" w:w="2600"/>
+          </w:tcPr>
+          <w:p>
+            <w:pPr>
+              <w:pStyle w:val="Compact"/>
+              <w:jc w:val="left"/>
+            </w:pPr>
+            <w:r>
+              <w:rPr>
+                <w:b w:val="0"/>
+              </w:rPr>
+              <w:t>deepseek-r1:1.5b</w:t>
+            </w:r>
+          </w:p>
+        </w:tc>
+        <w:tc>
+          <w:tcPr>
+            <w:tcW w:type="dxa" w:w="2079"/>
+          </w:tcPr>
+          <w:p>
+            <w:pPr>
+              <w:pStyle w:val="Compact"/>
+              <w:jc w:val="center"/>
+            </w:pPr>
+            <w:r>
+              <w:rPr>
+                <w:b w:val="0"/>
+              </w:rPr>
+              <w:t>−0,6151</w:t>
+            </w:r>
+          </w:p>
+        </w:tc>
+        <w:tc>
+          <w:tcPr>
+            <w:tcW w:type="dxa" w:w="2079"/>
+          </w:tcPr>
+          <w:p>
+            <w:pPr>
+              <w:pStyle w:val="Compact"/>
+              <w:jc w:val="center"/>
+            </w:pPr>
+            <w:r>
+              <w:rPr>
+                <w:b w:val="0"/>
+              </w:rPr>
+              <w:t>0,0333</w:t>
+            </w:r>
+          </w:p>
+        </w:tc>
+        <w:tc>
+          <w:tcPr>
+            <w:tcW w:type="dxa" w:w="2080"/>
+          </w:tcPr>
+          <w:p>
+            <w:pPr>
+              <w:pStyle w:val="Compact"/>
+              <w:jc w:val="center"/>
+            </w:pPr>
+            <w:r>
+              <w:rPr>
+                <w:b w:val="0"/>
+              </w:rPr>
+              <w:t>−0,0070</w:t>
+            </w:r>
+          </w:p>
+        </w:tc>
+      </w:tr>
+      <w:tr>
+        <w:tc>
+          <w:tcPr>
+            <w:tcW w:type="dxa" w:w="2600"/>
+          </w:tcPr>
+          <w:p>
+            <w:pPr>
+              <w:pStyle w:val="Compact"/>
+              <w:jc w:val="left"/>
+            </w:pPr>
+            <w:r>
+              <w:rPr>
+                <w:b w:val="0"/>
+              </w:rPr>
+              <w:t>gemma4:12b-mlx</w:t>
+            </w:r>
+          </w:p>
+        </w:tc>
+        <w:tc>
+          <w:tcPr>
+            <w:tcW w:type="dxa" w:w="2079"/>
+          </w:tcPr>
+          <w:p>
+            <w:pPr>
+              <w:pStyle w:val="Compact"/>
+              <w:jc w:val="center"/>
+            </w:pPr>
+            <w:r>
+              <w:rPr>
+                <w:b w:val="0"/>
+              </w:rPr>
+              <w:t>−0,4964</w:t>
+            </w:r>
+          </w:p>
+        </w:tc>
+        <w:tc>
+          <w:tcPr>
+            <w:tcW w:type="dxa" w:w="2079"/>
+          </w:tcPr>
+          <w:p>
+            <w:pPr>
+              <w:pStyle w:val="Compact"/>
+              <w:jc w:val="center"/>
+            </w:pPr>
+            <w:r>
+              <w:rPr>
+                <w:b w:val="0"/>
+              </w:rPr>
+              <w:t>0,1006</w:t>
+            </w:r>
+          </w:p>
+        </w:tc>
+        <w:tc>
+          <w:tcPr>
+            <w:tcW w:type="dxa" w:w="2080"/>
+          </w:tcPr>
+          <w:p>
+            <w:pPr>
+              <w:pStyle w:val="Compact"/>
+              <w:jc w:val="center"/>
+            </w:pPr>
+            <w:r>
+              <w:rPr>
+                <w:b w:val="0"/>
+              </w:rPr>
+              <w:t>−0,1259</w:t>
+            </w:r>
+          </w:p>
+        </w:tc>
+      </w:tr>
+      <w:tr>
+        <w:tc>
+          <w:tcPr>
+            <w:tcW w:type="dxa" w:w="2600"/>
+          </w:tcPr>
+          <w:p>
+            <w:pPr>
+              <w:pStyle w:val="Compact"/>
+              <w:jc w:val="left"/>
+            </w:pPr>
+            <w:r>
+              <w:rPr>
+                <w:b w:val="0"/>
+              </w:rPr>
+              <w:t>gemma4:31b-cloud</w:t>
+            </w:r>
+          </w:p>
+        </w:tc>
+        <w:tc>
+          <w:tcPr>
+            <w:tcW w:type="dxa" w:w="2079"/>
+          </w:tcPr>
+          <w:p>
+            <w:pPr>
+              <w:pStyle w:val="Compact"/>
+              <w:jc w:val="center"/>
+            </w:pPr>
+            <w:r>
+              <w:rPr>
+                <w:b w:val="0"/>
+              </w:rPr>
+              <w:t>−0,4746</w:t>
+            </w:r>
+          </w:p>
+        </w:tc>
+        <w:tc>
+          <w:tcPr>
+            <w:tcW w:type="dxa" w:w="2079"/>
+          </w:tcPr>
+          <w:p>
+            <w:pPr>
+              <w:pStyle w:val="Compact"/>
+              <w:jc w:val="center"/>
+            </w:pPr>
+            <w:r>
+              <w:rPr>
+                <w:b w:val="0"/>
+              </w:rPr>
+              <w:t>0,1190</w:t>
+            </w:r>
+          </w:p>
+        </w:tc>
+        <w:tc>
+          <w:tcPr>
+            <w:tcW w:type="dxa" w:w="2080"/>
+          </w:tcPr>
+          <w:p>
+            <w:pPr>
+              <w:pStyle w:val="Compact"/>
+              <w:jc w:val="center"/>
+            </w:pPr>
+            <w:r>
+              <w:rPr>
+                <w:b w:val="0"/>
+              </w:rPr>
+              <w:t>−0,0559</w:t>
+            </w:r>
+          </w:p>
+        </w:tc>
+      </w:tr>
+      <w:tr>
+        <w:tc>
+          <w:tcPr>
+            <w:tcW w:type="dxa" w:w="2600"/>
+          </w:tcPr>
+          <w:p>
+            <w:pPr>
+              <w:pStyle w:val="Compact"/>
+              <w:jc w:val="left"/>
+            </w:pPr>
+            <w:r>
+              <w:rPr>
+                <w:b w:val="0"/>
+              </w:rPr>
+              <w:t>gemma4:31b-mlx</w:t>
+            </w:r>
+          </w:p>
+        </w:tc>
+        <w:tc>
+          <w:tcPr>
+            <w:tcW w:type="dxa" w:w="2079"/>
+          </w:tcPr>
+          <w:p>
+            <w:pPr>
+              <w:pStyle w:val="Compact"/>
+              <w:jc w:val="center"/>
+            </w:pPr>
+            <w:r>
+              <w:rPr>
+                <w:b w:val="0"/>
+              </w:rPr>
+              <w:t>−0,4773</w:t>
+            </w:r>
+          </w:p>
+        </w:tc>
+        <w:tc>
+          <w:tcPr>
+            <w:tcW w:type="dxa" w:w="2079"/>
+          </w:tcPr>
+          <w:p>
+            <w:pPr>
+              <w:pStyle w:val="Compact"/>
+              <w:jc w:val="center"/>
+            </w:pPr>
+            <w:r>
+              <w:rPr>
+                <w:b w:val="0"/>
+              </w:rPr>
+              <w:t>0,1166</w:t>
+            </w:r>
+          </w:p>
+        </w:tc>
+        <w:tc>
+          <w:tcPr>
+            <w:tcW w:type="dxa" w:w="2080"/>
+          </w:tcPr>
+          <w:p>
+            <w:pPr>
+              <w:pStyle w:val="Compact"/>
+              <w:jc w:val="center"/>
+            </w:pPr>
+            <w:r>
+              <w:rPr>
+                <w:b w:val="0"/>
+              </w:rPr>
+              <w:t>−0,0559</w:t>
+            </w:r>
+          </w:p>
+        </w:tc>
+      </w:tr>
+      <w:tr>
+        <w:tc>
+          <w:tcPr>
+            <w:tcW w:type="dxa" w:w="2600"/>
+          </w:tcPr>
+          <w:p>
+            <w:pPr>
+              <w:pStyle w:val="Compact"/>
+              <w:jc w:val="left"/>
+            </w:pPr>
+            <w:r>
+              <w:rPr>
+                <w:b w:val="0"/>
+              </w:rPr>
+              <w:t>gemma4:latest</w:t>
+            </w:r>
+          </w:p>
+        </w:tc>
+        <w:tc>
+          <w:tcPr>
+            <w:tcW w:type="dxa" w:w="2079"/>
+          </w:tcPr>
+          <w:p>
+            <w:pPr>
+              <w:pStyle w:val="Compact"/>
+              <w:jc w:val="center"/>
+            </w:pPr>
+            <w:r>
+              <w:rPr>
+                <w:b w:val="0"/>
+              </w:rPr>
+              <w:t>−0,4955</w:t>
+            </w:r>
+          </w:p>
+        </w:tc>
+        <w:tc>
+          <w:tcPr>
+            <w:tcW w:type="dxa" w:w="2079"/>
+          </w:tcPr>
+          <w:p>
+            <w:pPr>
+              <w:pStyle w:val="Compact"/>
+              <w:jc w:val="center"/>
+            </w:pPr>
+            <w:r>
+              <w:rPr>
+                <w:b w:val="0"/>
+              </w:rPr>
+              <w:t>0,1014</w:t>
+            </w:r>
+          </w:p>
+        </w:tc>
+        <w:tc>
+          <w:tcPr>
+            <w:tcW w:type="dxa" w:w="2080"/>
+          </w:tcPr>
+          <w:p>
+            <w:pPr>
+              <w:pStyle w:val="Compact"/>
+              <w:jc w:val="center"/>
+            </w:pPr>
+            <w:r>
+              <w:rPr>
+                <w:b w:val="0"/>
+              </w:rPr>
+              <w:t>−0,1259</w:t>
+            </w:r>
+          </w:p>
+        </w:tc>
+      </w:tr>
+      <w:tr>
+        <w:tc>
+          <w:tcPr>
+            <w:tcW w:type="dxa" w:w="2600"/>
+          </w:tcPr>
+          <w:p>
+            <w:pPr>
+              <w:pStyle w:val="Compact"/>
+              <w:jc w:val="left"/>
+            </w:pPr>
+            <w:r>
+              <w:rPr>
+                <w:b w:val="0"/>
+              </w:rPr>
+              <w:t>gemma:latest</w:t>
+            </w:r>
+          </w:p>
+        </w:tc>
+        <w:tc>
+          <w:tcPr>
+            <w:tcW w:type="dxa" w:w="2079"/>
+          </w:tcPr>
+          <w:p>
+            <w:pPr>
+              <w:pStyle w:val="Compact"/>
+              <w:jc w:val="center"/>
+            </w:pPr>
+            <w:r>
+              <w:rPr>
+                <w:b w:val="0"/>
+              </w:rPr>
+              <w:t>−0,5047</w:t>
+            </w:r>
+          </w:p>
+        </w:tc>
+        <w:tc>
+          <w:tcPr>
+            <w:tcW w:type="dxa" w:w="2079"/>
+          </w:tcPr>
+          <w:p>
+            <w:pPr>
+              <w:pStyle w:val="Compact"/>
+              <w:jc w:val="center"/>
+            </w:pPr>
+            <w:r>
+              <w:rPr>
+                <w:b w:val="0"/>
+              </w:rPr>
+              <w:t>0,0942</w:t>
+            </w:r>
+          </w:p>
+        </w:tc>
+        <w:tc>
+          <w:tcPr>
+            <w:tcW w:type="dxa" w:w="2080"/>
+          </w:tcPr>
+          <w:p>
+            <w:pPr>
+              <w:pStyle w:val="Compact"/>
+              <w:jc w:val="center"/>
+            </w:pPr>
+            <w:r>
+              <w:rPr>
+                <w:b w:val="0"/>
+              </w:rPr>
+              <w:t>−0,2238</w:t>
+            </w:r>
+          </w:p>
+        </w:tc>
+      </w:tr>
+      <w:tr>
+        <w:tc>
+          <w:tcPr>
+            <w:tcW w:type="dxa" w:w="2600"/>
+          </w:tcPr>
+          <w:p>
+            <w:pPr>
+              <w:pStyle w:val="Compact"/>
+              <w:jc w:val="left"/>
+            </w:pPr>
+            <w:r>
+              <w:rPr>
+                <w:b w:val="0"/>
+              </w:rPr>
+              <w:t>gpt-oss:20b</w:t>
+            </w:r>
+          </w:p>
+        </w:tc>
+        <w:tc>
+          <w:tcPr>
+            <w:tcW w:type="dxa" w:w="2079"/>
+          </w:tcPr>
+          <w:p>
+            <w:pPr>
+              <w:pStyle w:val="Compact"/>
+              <w:jc w:val="center"/>
+            </w:pPr>
+            <w:r>
+              <w:rPr>
+                <w:b w:val="0"/>
+              </w:rPr>
+              <w:t>−0,4832</w:t>
+            </w:r>
+          </w:p>
+        </w:tc>
+        <w:tc>
+          <w:tcPr>
+            <w:tcW w:type="dxa" w:w="2079"/>
+          </w:tcPr>
+          <w:p>
+            <w:pPr>
+              <w:pStyle w:val="Compact"/>
+              <w:jc w:val="center"/>
+            </w:pPr>
+            <w:r>
+              <w:rPr>
+                <w:b w:val="0"/>
+              </w:rPr>
+              <w:t>0,1115</w:t>
+            </w:r>
+          </w:p>
+        </w:tc>
+        <w:tc>
+          <w:tcPr>
+            <w:tcW w:type="dxa" w:w="2080"/>
+          </w:tcPr>
+          <w:p>
+            <w:pPr>
+              <w:pStyle w:val="Compact"/>
+              <w:jc w:val="center"/>
+            </w:pPr>
+            <w:r>
+              <w:rPr>
+                <w:b w:val="0"/>
+              </w:rPr>
+              <w:t>−0,0699</w:t>
+            </w:r>
+          </w:p>
+        </w:tc>
+      </w:tr>
+      <w:tr>
+        <w:tc>
+          <w:tcPr>
+            <w:tcW w:type="dxa" w:w="2600"/>
+          </w:tcPr>
+          <w:p>
+            <w:pPr>
+              <w:pStyle w:val="Compact"/>
+              <w:jc w:val="left"/>
+            </w:pPr>
+            <w:r>
+              <w:rPr>
+                <w:b w:val="0"/>
+              </w:rPr>
+              <w:t>llama3.1:8b</w:t>
+            </w:r>
+          </w:p>
+        </w:tc>
+        <w:tc>
+          <w:tcPr>
+            <w:tcW w:type="dxa" w:w="2079"/>
+          </w:tcPr>
+          <w:p>
+            <w:pPr>
+              <w:pStyle w:val="Compact"/>
+              <w:jc w:val="center"/>
+            </w:pPr>
+            <w:r>
+              <w:rPr>
+                <w:b w:val="0"/>
+              </w:rPr>
+              <w:t>−0,4840</w:t>
+            </w:r>
+          </w:p>
+        </w:tc>
+        <w:tc>
+          <w:tcPr>
+            <w:tcW w:type="dxa" w:w="2079"/>
+          </w:tcPr>
+          <w:p>
+            <w:pPr>
+              <w:pStyle w:val="Compact"/>
+              <w:jc w:val="center"/>
+            </w:pPr>
+            <w:r>
+              <w:rPr>
+                <w:b w:val="0"/>
+              </w:rPr>
+              <w:t>0,1108</w:t>
+            </w:r>
+          </w:p>
+        </w:tc>
+        <w:tc>
+          <w:tcPr>
+            <w:tcW w:type="dxa" w:w="2080"/>
+          </w:tcPr>
+          <w:p>
+            <w:pPr>
+              <w:pStyle w:val="Compact"/>
+              <w:jc w:val="center"/>
+            </w:pPr>
+            <w:r>
+              <w:rPr>
+                <w:b w:val="0"/>
+              </w:rPr>
+              <w:t>−0,0839</w:t>
+            </w:r>
+          </w:p>
+        </w:tc>
+      </w:tr>
+      <w:tr>
+        <w:tc>
+          <w:tcPr>
+            <w:tcW w:type="dxa" w:w="2600"/>
+          </w:tcPr>
+          <w:p>
+            <w:pPr>
+              <w:pStyle w:val="Compact"/>
+              <w:jc w:val="left"/>
+            </w:pPr>
+            <w:r>
+              <w:rPr>
+                <w:b w:val="0"/>
+              </w:rPr>
+              <w:t>llama3.2:latest</w:t>
+            </w:r>
+          </w:p>
+        </w:tc>
+        <w:tc>
+          <w:tcPr>
+            <w:tcW w:type="dxa" w:w="2079"/>
+          </w:tcPr>
+          <w:p>
+            <w:pPr>
+              <w:pStyle w:val="Compact"/>
+              <w:jc w:val="center"/>
+            </w:pPr>
+            <w:r>
+              <w:rPr>
+                <w:b w:val="0"/>
+              </w:rPr>
+              <w:t>−0,5063</w:t>
+            </w:r>
+          </w:p>
+        </w:tc>
+        <w:tc>
+          <w:tcPr>
+            <w:tcW w:type="dxa" w:w="2079"/>
+          </w:tcPr>
+          <w:p>
+            <w:pPr>
+              <w:pStyle w:val="Compact"/>
+              <w:jc w:val="center"/>
+            </w:pPr>
+            <w:r>
+              <w:rPr>
+                <w:b w:val="0"/>
+              </w:rPr>
+              <w:t>0,0930</w:t>
+            </w:r>
+          </w:p>
+        </w:tc>
+        <w:tc>
+          <w:tcPr>
+            <w:tcW w:type="dxa" w:w="2080"/>
+          </w:tcPr>
+          <w:p>
+            <w:pPr>
+              <w:pStyle w:val="Compact"/>
+              <w:jc w:val="center"/>
+            </w:pPr>
+            <w:r>
+              <w:rPr>
+                <w:b w:val="0"/>
+              </w:rPr>
+              <w:t>−0,0070</w:t>
+            </w:r>
+          </w:p>
+        </w:tc>
+      </w:tr>
+      <w:tr>
+        <w:tc>
+          <w:tcPr>
+            <w:tcW w:type="dxa" w:w="2600"/>
+          </w:tcPr>
+          <w:p>
+            <w:pPr>
+              <w:pStyle w:val="Compact"/>
+              <w:jc w:val="left"/>
+            </w:pPr>
+            <w:r>
+              <w:rPr>
+                <w:b w:val="0"/>
+              </w:rPr>
+              <w:t>mistral-nemo:latest</w:t>
+            </w:r>
+          </w:p>
+        </w:tc>
+        <w:tc>
+          <w:tcPr>
+            <w:tcW w:type="dxa" w:w="2079"/>
+          </w:tcPr>
+          <w:p>
+            <w:pPr>
+              <w:pStyle w:val="Compact"/>
+              <w:jc w:val="center"/>
+            </w:pPr>
+            <w:r>
+              <w:rPr>
+                <w:b w:val="0"/>
+              </w:rPr>
+              <w:t>−0,5971</w:t>
+            </w:r>
+          </w:p>
+        </w:tc>
+        <w:tc>
+          <w:tcPr>
+            <w:tcW w:type="dxa" w:w="2079"/>
+          </w:tcPr>
+          <w:p>
+            <w:pPr>
+              <w:pStyle w:val="Compact"/>
+              <w:jc w:val="center"/>
+            </w:pPr>
+            <w:r>
+              <w:rPr>
+                <w:b w:val="0"/>
+              </w:rPr>
+              <w:t>0,0404</w:t>
+            </w:r>
+          </w:p>
+        </w:tc>
+        <w:tc>
+          <w:tcPr>
+            <w:tcW w:type="dxa" w:w="2080"/>
+          </w:tcPr>
+          <w:p>
+            <w:pPr>
+              <w:pStyle w:val="Compact"/>
+              <w:jc w:val="center"/>
+            </w:pPr>
+            <w:r>
+              <w:rPr>
+                <w:b w:val="0"/>
+              </w:rPr>
+              <w:t>−0,2378</w:t>
+            </w:r>
+          </w:p>
+        </w:tc>
+      </w:tr>
+      <w:tr>
+        <w:tc>
+          <w:tcPr>
+            <w:tcW w:type="dxa" w:w="2600"/>
+          </w:tcPr>
+          <w:p>
+            <w:pPr>
+              <w:pStyle w:val="Compact"/>
+              <w:jc w:val="left"/>
+            </w:pPr>
+            <w:r>
+              <w:rPr>
+                <w:b/>
+              </w:rPr>
+              <w:t>nemotron-mini:4b</w:t>
+            </w:r>
+          </w:p>
+        </w:tc>
+        <w:tc>
+          <w:tcPr>
+            <w:tcW w:type="dxa" w:w="2079"/>
+          </w:tcPr>
+          <w:p>
+            <w:pPr>
+              <w:pStyle w:val="Compact"/>
+              <w:jc w:val="center"/>
+            </w:pPr>
+            <w:r>
+              <w:rPr>
+                <w:b/>
+              </w:rPr>
+              <w:t>+0,0120</w:t>
+            </w:r>
+          </w:p>
+        </w:tc>
+        <w:tc>
+          <w:tcPr>
+            <w:tcW w:type="dxa" w:w="2079"/>
+          </w:tcPr>
+          <w:p>
+            <w:pPr>
+              <w:pStyle w:val="Compact"/>
+              <w:jc w:val="center"/>
+            </w:pPr>
+            <w:r>
+              <w:rPr>
+                <w:b/>
+              </w:rPr>
+              <w:t>0,9706</w:t>
+            </w:r>
+          </w:p>
+        </w:tc>
+        <w:tc>
+          <w:tcPr>
+            <w:tcW w:type="dxa" w:w="2080"/>
+          </w:tcPr>
+          <w:p>
+            <w:pPr>
+              <w:pStyle w:val="Compact"/>
+              <w:jc w:val="center"/>
+            </w:pPr>
+            <w:r>
+              <w:rPr>
+                <w:b/>
+              </w:rPr>
+              <w:t>+0,1608</w:t>
+            </w:r>
+          </w:p>
+        </w:tc>
+      </w:tr>
+      <w:tr>
+        <w:tc>
+          <w:tcPr>
+            <w:tcW w:type="dxa" w:w="2600"/>
+          </w:tcPr>
+          <w:p>
+            <w:pPr>
+              <w:pStyle w:val="Compact"/>
+              <w:jc w:val="left"/>
+            </w:pPr>
+            <w:r>
+              <w:rPr>
+                <w:b w:val="0"/>
+              </w:rPr>
+              <w:t>qwen2.5:14b</w:t>
+            </w:r>
+          </w:p>
+        </w:tc>
+        <w:tc>
+          <w:tcPr>
+            <w:tcW w:type="dxa" w:w="2079"/>
+          </w:tcPr>
+          <w:p>
+            <w:pPr>
+              <w:pStyle w:val="Compact"/>
+              <w:jc w:val="center"/>
+            </w:pPr>
+            <w:r>
+              <w:rPr>
+                <w:b w:val="0"/>
+              </w:rPr>
+              <w:t>−0,4767</w:t>
+            </w:r>
+          </w:p>
+        </w:tc>
+        <w:tc>
+          <w:tcPr>
+            <w:tcW w:type="dxa" w:w="2079"/>
+          </w:tcPr>
+          <w:p>
+            <w:pPr>
+              <w:pStyle w:val="Compact"/>
+              <w:jc w:val="center"/>
+            </w:pPr>
+            <w:r>
+              <w:rPr>
+                <w:b w:val="0"/>
+              </w:rPr>
+              <w:t>0,1171</w:t>
+            </w:r>
+          </w:p>
+        </w:tc>
+        <w:tc>
+          <w:tcPr>
+            <w:tcW w:type="dxa" w:w="2080"/>
+          </w:tcPr>
+          <w:p>
+            <w:pPr>
+              <w:pStyle w:val="Compact"/>
+              <w:jc w:val="center"/>
+            </w:pPr>
+            <w:r>
+              <w:rPr>
+                <w:b w:val="0"/>
+              </w:rPr>
+              <w:t>−0,1469</w:t>
+            </w:r>
+          </w:p>
+        </w:tc>
+      </w:tr>
+      <w:tr>
+        <w:tc>
+          <w:tcPr>
+            <w:tcW w:type="dxa" w:w="2600"/>
+          </w:tcPr>
+          <w:p>
+            <w:pPr>
+              <w:pStyle w:val="Compact"/>
+              <w:jc w:val="left"/>
+            </w:pPr>
+            <w:r>
+              <w:rPr>
+                <w:b w:val="0"/>
+              </w:rPr>
+              <w:t>qwen3:8b</w:t>
+            </w:r>
+          </w:p>
+        </w:tc>
+        <w:tc>
+          <w:tcPr>
+            <w:tcW w:type="dxa" w:w="2079"/>
+          </w:tcPr>
+          <w:p>
+            <w:pPr>
+              <w:pStyle w:val="Compact"/>
+              <w:jc w:val="center"/>
+            </w:pPr>
+            <w:r>
+              <w:rPr>
+                <w:b w:val="0"/>
+              </w:rPr>
+              <w:t>−0,4771</w:t>
+            </w:r>
+          </w:p>
+        </w:tc>
+        <w:tc>
+          <w:tcPr>
+            <w:tcW w:type="dxa" w:w="2079"/>
+          </w:tcPr>
+          <w:p>
+            <w:pPr>
+              <w:pStyle w:val="Compact"/>
+              <w:jc w:val="center"/>
+            </w:pPr>
+            <w:r>
+              <w:rPr>
+                <w:b w:val="0"/>
+              </w:rPr>
+              <w:t>0,1168</w:t>
+            </w:r>
+          </w:p>
+        </w:tc>
+        <w:tc>
+          <w:tcPr>
+            <w:tcW w:type="dxa" w:w="2080"/>
+          </w:tcPr>
+          <w:p>
+            <w:pPr>
+              <w:pStyle w:val="Compact"/>
+              <w:jc w:val="center"/>
+            </w:pPr>
+            <w:r>
+              <w:rPr>
+                <w:b w:val="0"/>
+              </w:rPr>
+              <w:t>−0,1678</w:t>
+            </w:r>
+          </w:p>
+        </w:tc>
+      </w:tr>
+    </w:tbl>
+    <w:p>
+      <w:pPr>
+        <w:numPr>
+          <w:ilvl w:val="0"/>
+          <w:numId w:val="0"/>
+        </w:numPr>
+        <w:pStyle w:val="BodyText"/>
+      </w:pPr>
+      <w:r>
+        <w:t xml:space="preserve">El detalle íntegro, con más decimales, está en el propio artefacto JSON citado al inicio de este anexo.</w:t>
+      </w:r>
+    </w:p>
+    <w:p>
+      <w:pPr>
+        <w:numPr>
+          <w:ilvl w:val="0"/>
+          <w:numId w:val="0"/>
+        </w:numPr>
+        <w:pStyle w:val="Heading2"/>
+      </w:pPr>
+      <w:r>
+        <w:t>Anexo K — Intervalo de confianza de la Tabla 7 por réplica de semilla (N=120, cinco semillas)</w:t>
+      </w:r>
+    </w:p>
+    <w:p>
+      <w:pPr>
+        <w:numPr>
+          <w:ilvl w:val="0"/>
+          <w:numId w:val="0"/>
+        </w:numPr>
+        <w:pStyle w:val="BodyText"/>
+      </w:pPr>
+      <w:r>
+        <w:t xml:space="preserve">La Tabla 7 (§5.3.1) reporta un único punto por modelo, tomado de una corrida (recorrida_20260908, consolidada en results/ANALISIS_CONJUNTO_20260909_FIX/). Para acotar cuánto varía ese punto por el azar de la generación, se replicó el mismo protocolo sobre cinco semillas declaradas (42, 123, 456, 789, 1024) en once de los trece modelos de la Tabla 7, con 2 640 evaluaciones por semilla (13 200 en total, 0 fallidas), en repos/ner-llm-entity-benchmark/results/barras_error_n120_REMOTO/. Quedan fuera de esta réplica qwen2.5:14b y gemma:latest, que no formaron parte de la corrida de barra de error.</w:t>
+      </w:r>
+    </w:p>
+    <w:p>
+      <w:pPr>
+        <w:numPr>
+          <w:ilvl w:val="0"/>
+          <w:numId w:val="0"/>
+        </w:numPr>
+        <w:pStyle w:val="BodyText"/>
+      </w:pPr>
+      <w:r>
+        <w:t xml:space="preserve">El cálculo, en results/R2_CONSOLIDADO_5SEMILLAS_20260916/calcular_intervalos_confianza.py, promedia el F1 por artículo dentro de cada semilla sobre los mismos 113 artículos que usa la Tabla 7 (se excluyen los siete con codificación contaminada, Anexo H), y calcula el intervalo de confianza al 95 % con distribución t de Student sobre las cinco medias resultantes. Antes de aplicarlo a los once modelos se verificó que reproduce exactamente el punto ya publicado: la media de la semilla 42 para gemma4:31b-mlx da 81,47 %, idéntica a la cifra de la Tabla 7.</w:t>
+      </w:r>
+    </w:p>
+    <w:p>
+      <w:pPr>
+        <w:numPr>
+          <w:ilvl w:val="0"/>
+          <w:numId w:val="0"/>
+        </w:numPr>
+        <w:pStyle w:val="BodyText"/>
+      </w:pPr>
+      <w:r>
+        <w:t xml:space="preserve">El cálculo parte del CSV de resultados por artículo, no del resumen agregado que trae cada corrida: el de gemma4:31b-cloud no se pudo usar directamente porque no reflejaba sus propios datos crudos en ninguna de las cinco semillas, un desajuste que no afecta al resto de los modelos ni a la fuente primaria por artículo.</w:t>
+      </w:r>
+    </w:p>
+    <w:p>
+      <w:pPr>
+        <w:numPr>
+          <w:ilvl w:val="0"/>
+          <w:numId w:val="0"/>
+        </w:numPr>
+        <w:pStyle w:val="BodyText"/>
+      </w:pPr>
+      <w:r>
+        <w:t xml:space="preserve">La Tabla 21 recoge, para cada uno de los once modelos, la media y el intervalo de confianza al 95 % del F1 sobre las cinco semillas, en modo baseline y KB RAG.</w:t>
+      </w:r>
+    </w:p>
+    <w:p>
+      <w:pPr>
+        <w:numPr>
+          <w:ilvl w:val="0"/>
+          <w:numId w:val="0"/>
+        </w:numPr>
+        <w:pStyle w:val="TableCaption"/>
+      </w:pPr>
+      <w:r>
+        <w:t>Tabla 21. Media e intervalo de confianza al 95 % del F1 sobre cinco semillas (N=120, once modelos)</w:t>
+      </w:r>
+    </w:p>
+    <w:tbl>
+      <w:tblPr>
+        <w:tblStyle w:val="Table"/>
+        <w:tblW w:type="pct" w:w="5000"/>
+        <w:tblLayout w:type="fixed"/>
+        <w:tblLook w:firstRow="1" w:lastRow="0" w:firstColumn="0" w:lastColumn="0" w:noHBand="0" w:noVBand="0" w:val="0020"/>
+      </w:tblPr>
+      <w:tblGrid>
+        <w:gridCol w:w="2200"/>
+        <w:gridCol w:w="3319"/>
+        <w:gridCol w:w="3319"/>
+      </w:tblGrid>
+      <w:tr>
+        <w:trPr>
+          <w:tblHeader w:val="on"/>
+        </w:trPr>
+        <w:tc>
+          <w:tcPr>
+            <w:tcW w:type="dxa" w:w="2200"/>
+          </w:tcPr>
+          <w:p>
+            <w:pPr>
+              <w:pStyle w:val="Compact"/>
+              <w:jc w:val="left"/>
+            </w:pPr>
+            <w:r>
+              <w:rPr>
+                <w:b/>
+              </w:rPr>
+              <w:t>Modelo</w:t>
+            </w:r>
+          </w:p>
+        </w:tc>
+        <w:tc>
+          <w:tcPr>
+            <w:tcW w:type="dxa" w:w="3319"/>
+          </w:tcPr>
+          <w:p>
+            <w:pPr>
+              <w:pStyle w:val="Compact"/>
+              <w:jc w:val="center"/>
+            </w:pPr>
+            <w:r>
+              <w:rPr>
+                <w:b/>
+              </w:rPr>
+              <w:t>F1 baseline (media, IC95%)</w:t>
+            </w:r>
+          </w:p>
+        </w:tc>
+        <w:tc>
+          <w:tcPr>
+            <w:tcW w:type="dxa" w:w="3319"/>
+          </w:tcPr>
+          <w:p>
+            <w:pPr>
+              <w:pStyle w:val="Compact"/>
+              <w:jc w:val="center"/>
+            </w:pPr>
+            <w:r>
+              <w:rPr>
+                <w:b/>
+              </w:rPr>
+              <w:t>F1 KB RAG (media, IC95%)</w:t>
+            </w:r>
+          </w:p>
+        </w:tc>
+      </w:tr>
+      <w:tr>
+        <w:tc>
+          <w:tcPr>
+            <w:tcW w:type="dxa" w:w="2200"/>
+          </w:tcPr>
+          <w:p>
+            <w:pPr>
+              <w:pStyle w:val="Compact"/>
+              <w:jc w:val="left"/>
+            </w:pPr>
+            <w:r>
+              <w:rPr>
+                <w:b w:val="0"/>
+              </w:rPr>
+              <w:t>gemma4:31b-cloud</w:t>
+            </w:r>
+          </w:p>
+        </w:tc>
+        <w:tc>
+          <w:tcPr>
+            <w:tcW w:type="dxa" w:w="3319"/>
+          </w:tcPr>
+          <w:p>
+            <w:pPr>
+              <w:pStyle w:val="Compact"/>
+              <w:jc w:val="center"/>
+            </w:pPr>
+            <w:r>
+              <w:rPr>
+                <w:b w:val="0"/>
+              </w:rPr>
+              <w:t>81,87 % [81,58, 82,16]</w:t>
+            </w:r>
+          </w:p>
+        </w:tc>
+        <w:tc>
+          <w:tcPr>
+            <w:tcW w:type="dxa" w:w="3319"/>
+          </w:tcPr>
+          <w:p>
+            <w:pPr>
+              <w:pStyle w:val="Compact"/>
+              <w:jc w:val="center"/>
+            </w:pPr>
+            <w:r>
+              <w:rPr>
+                <w:b w:val="0"/>
+              </w:rPr>
+              <w:t>82,97 % [82,79, 83,16]</w:t>
+            </w:r>
+          </w:p>
+        </w:tc>
+      </w:tr>
+      <w:tr>
+        <w:tc>
+          <w:tcPr>
+            <w:tcW w:type="dxa" w:w="2200"/>
+          </w:tcPr>
+          <w:p>
+            <w:pPr>
+              <w:pStyle w:val="Compact"/>
+              <w:jc w:val="left"/>
+            </w:pPr>
+            <w:r>
+              <w:rPr>
+                <w:b w:val="0"/>
+              </w:rPr>
+              <w:t>gemma4:31b-mlx</w:t>
+            </w:r>
+          </w:p>
+        </w:tc>
+        <w:tc>
+          <w:tcPr>
+            <w:tcW w:type="dxa" w:w="3319"/>
+          </w:tcPr>
+          <w:p>
+            <w:pPr>
+              <w:pStyle w:val="Compact"/>
+              <w:jc w:val="center"/>
+            </w:pPr>
+            <w:r>
+              <w:rPr>
+                <w:b w:val="0"/>
+              </w:rPr>
+              <w:t>81,56 % [81,45, 81,67]</w:t>
+            </w:r>
+          </w:p>
+        </w:tc>
+        <w:tc>
+          <w:tcPr>
+            <w:tcW w:type="dxa" w:w="3319"/>
+          </w:tcPr>
+          <w:p>
+            <w:pPr>
+              <w:pStyle w:val="Compact"/>
+              <w:jc w:val="center"/>
+            </w:pPr>
+            <w:r>
+              <w:rPr>
+                <w:b w:val="0"/>
+              </w:rPr>
+              <w:t>82,49 % [82,42, 82,55]</w:t>
+            </w:r>
+          </w:p>
+        </w:tc>
+      </w:tr>
+      <w:tr>
+        <w:tc>
+          <w:tcPr>
+            <w:tcW w:type="dxa" w:w="2200"/>
+          </w:tcPr>
+          <w:p>
+            <w:pPr>
+              <w:pStyle w:val="Compact"/>
+              <w:jc w:val="left"/>
+            </w:pPr>
+            <w:r>
+              <w:rPr>
+                <w:b w:val="0"/>
+              </w:rPr>
+              <w:t>gemma4:12b-mlx</w:t>
+            </w:r>
+          </w:p>
+        </w:tc>
+        <w:tc>
+          <w:tcPr>
+            <w:tcW w:type="dxa" w:w="3319"/>
+          </w:tcPr>
+          <w:p>
+            <w:pPr>
+              <w:pStyle w:val="Compact"/>
+              <w:jc w:val="center"/>
+            </w:pPr>
+            <w:r>
+              <w:rPr>
+                <w:b w:val="0"/>
+              </w:rPr>
+              <w:t>77,96 % [77,80, 78,13]</w:t>
+            </w:r>
+          </w:p>
+        </w:tc>
+        <w:tc>
+          <w:tcPr>
+            <w:tcW w:type="dxa" w:w="3319"/>
+          </w:tcPr>
+          <w:p>
+            <w:pPr>
+              <w:pStyle w:val="Compact"/>
+              <w:jc w:val="center"/>
+            </w:pPr>
+            <w:r>
+              <w:rPr>
+                <w:b w:val="0"/>
+              </w:rPr>
+              <w:t>79,84 % [79,77, 79,90]</w:t>
+            </w:r>
+          </w:p>
+        </w:tc>
+      </w:tr>
+      <w:tr>
+        <w:tc>
+          <w:tcPr>
+            <w:tcW w:type="dxa" w:w="2200"/>
+          </w:tcPr>
+          <w:p>
+            <w:pPr>
+              <w:pStyle w:val="Compact"/>
+              <w:jc w:val="left"/>
+            </w:pPr>
+            <w:r>
+              <w:rPr>
+                <w:b w:val="0"/>
+              </w:rPr>
+              <w:t>gpt-oss:20b</w:t>
+            </w:r>
+          </w:p>
+        </w:tc>
+        <w:tc>
+          <w:tcPr>
+            <w:tcW w:type="dxa" w:w="3319"/>
+          </w:tcPr>
+          <w:p>
+            <w:pPr>
+              <w:pStyle w:val="Compact"/>
+              <w:jc w:val="center"/>
+            </w:pPr>
+            <w:r>
+              <w:rPr>
+                <w:b w:val="0"/>
+              </w:rPr>
+              <w:t>75,50 % [74,46, 76,54]</w:t>
+            </w:r>
+          </w:p>
+        </w:tc>
+        <w:tc>
+          <w:tcPr>
+            <w:tcW w:type="dxa" w:w="3319"/>
+          </w:tcPr>
+          <w:p>
+            <w:pPr>
+              <w:pStyle w:val="Compact"/>
+              <w:jc w:val="center"/>
+            </w:pPr>
+            <w:r>
+              <w:rPr>
+                <w:b w:val="0"/>
+              </w:rPr>
+              <w:t>77,46 % [77,11, 77,81]</w:t>
+            </w:r>
+          </w:p>
+        </w:tc>
+      </w:tr>
+      <w:tr>
+        <w:tc>
+          <w:tcPr>
+            <w:tcW w:type="dxa" w:w="2200"/>
+          </w:tcPr>
+          <w:p>
+            <w:pPr>
+              <w:pStyle w:val="Compact"/>
+              <w:jc w:val="left"/>
+            </w:pPr>
+            <w:r>
+              <w:rPr>
+                <w:b w:val="0"/>
+              </w:rPr>
+              <w:t>gemma4:latest</w:t>
+            </w:r>
+          </w:p>
+        </w:tc>
+        <w:tc>
+          <w:tcPr>
+            <w:tcW w:type="dxa" w:w="3319"/>
+          </w:tcPr>
+          <w:p>
+            <w:pPr>
+              <w:pStyle w:val="Compact"/>
+              <w:jc w:val="center"/>
+            </w:pPr>
+            <w:r>
+              <w:rPr>
+                <w:b w:val="0"/>
+              </w:rPr>
+              <w:t>75,13 % [74,51, 75,74]</w:t>
+            </w:r>
+          </w:p>
+        </w:tc>
+        <w:tc>
+          <w:tcPr>
+            <w:tcW w:type="dxa" w:w="3319"/>
+          </w:tcPr>
+          <w:p>
+            <w:pPr>
+              <w:pStyle w:val="Compact"/>
+              <w:jc w:val="center"/>
+            </w:pPr>
+            <w:r>
+              <w:rPr>
+                <w:b w:val="0"/>
+              </w:rPr>
+              <w:t>77,98 % [77,44, 78,53]</w:t>
+            </w:r>
+          </w:p>
+        </w:tc>
+      </w:tr>
+      <w:tr>
+        <w:tc>
+          <w:tcPr>
+            <w:tcW w:type="dxa" w:w="2200"/>
+          </w:tcPr>
+          <w:p>
+            <w:pPr>
+              <w:pStyle w:val="Compact"/>
+              <w:jc w:val="left"/>
+            </w:pPr>
+            <w:r>
+              <w:rPr>
+                <w:b w:val="0"/>
+              </w:rPr>
+              <w:t>llama3.1:8b</w:t>
+            </w:r>
+          </w:p>
+        </w:tc>
+        <w:tc>
+          <w:tcPr>
+            <w:tcW w:type="dxa" w:w="3319"/>
+          </w:tcPr>
+          <w:p>
+            <w:pPr>
+              <w:pStyle w:val="Compact"/>
+              <w:jc w:val="center"/>
+            </w:pPr>
+            <w:r>
+              <w:rPr>
+                <w:b w:val="0"/>
+              </w:rPr>
+              <w:t>69,66 % [69,28, 70,04]</w:t>
+            </w:r>
+          </w:p>
+        </w:tc>
+        <w:tc>
+          <w:tcPr>
+            <w:tcW w:type="dxa" w:w="3319"/>
+          </w:tcPr>
+          <w:p>
+            <w:pPr>
+              <w:pStyle w:val="Compact"/>
+              <w:jc w:val="center"/>
+            </w:pPr>
+            <w:r>
+              <w:rPr>
+                <w:b w:val="0"/>
+              </w:rPr>
+              <w:t>71,43 % [71,00, 71,86]</w:t>
+            </w:r>
+          </w:p>
+        </w:tc>
+      </w:tr>
+      <w:tr>
+        <w:tc>
+          <w:tcPr>
+            <w:tcW w:type="dxa" w:w="2200"/>
+          </w:tcPr>
+          <w:p>
+            <w:pPr>
+              <w:pStyle w:val="Compact"/>
+              <w:jc w:val="left"/>
+            </w:pPr>
+            <w:r>
+              <w:rPr>
+                <w:b w:val="0"/>
+              </w:rPr>
+              <w:t>qwen3:8b</w:t>
+            </w:r>
+          </w:p>
+        </w:tc>
+        <w:tc>
+          <w:tcPr>
+            <w:tcW w:type="dxa" w:w="3319"/>
+          </w:tcPr>
+          <w:p>
+            <w:pPr>
+              <w:pStyle w:val="Compact"/>
+              <w:jc w:val="center"/>
+            </w:pPr>
+            <w:r>
+              <w:rPr>
+                <w:b w:val="0"/>
+              </w:rPr>
+              <w:t>68,92 % [68,77, 69,08]</w:t>
+            </w:r>
+          </w:p>
+        </w:tc>
+        <w:tc>
+          <w:tcPr>
+            <w:tcW w:type="dxa" w:w="3319"/>
+          </w:tcPr>
+          <w:p>
+            <w:pPr>
+              <w:pStyle w:val="Compact"/>
+              <w:jc w:val="center"/>
+            </w:pPr>
+            <w:r>
+              <w:rPr>
+                <w:b w:val="0"/>
+              </w:rPr>
+              <w:t>69,13 % [69,01, 69,25]</w:t>
+            </w:r>
+          </w:p>
+        </w:tc>
+      </w:tr>
+      <w:tr>
+        <w:tc>
+          <w:tcPr>
+            <w:tcW w:type="dxa" w:w="2200"/>
+          </w:tcPr>
+          <w:p>
+            <w:pPr>
+              <w:pStyle w:val="Compact"/>
+              <w:jc w:val="left"/>
+            </w:pPr>
+            <w:r>
+              <w:rPr>
+                <w:b w:val="0"/>
+              </w:rPr>
+              <w:t>llama3.2:latest</w:t>
+            </w:r>
+          </w:p>
+        </w:tc>
+        <w:tc>
+          <w:tcPr>
+            <w:tcW w:type="dxa" w:w="3319"/>
+          </w:tcPr>
+          <w:p>
+            <w:pPr>
+              <w:pStyle w:val="Compact"/>
+              <w:jc w:val="center"/>
+            </w:pPr>
+            <w:r>
+              <w:rPr>
+                <w:b w:val="0"/>
+              </w:rPr>
+              <w:t>62,46 % [61,63, 63,29]</w:t>
+            </w:r>
+          </w:p>
+        </w:tc>
+        <w:tc>
+          <w:tcPr>
+            <w:tcW w:type="dxa" w:w="3319"/>
+          </w:tcPr>
+          <w:p>
+            <w:pPr>
+              <w:pStyle w:val="Compact"/>
+              <w:jc w:val="center"/>
+            </w:pPr>
+            <w:r>
+              <w:rPr>
+                <w:b w:val="0"/>
+              </w:rPr>
+              <w:t>69,67 % [69,39, 69,95]</w:t>
+            </w:r>
+          </w:p>
+        </w:tc>
+      </w:tr>
+      <w:tr>
+        <w:tc>
+          <w:tcPr>
+            <w:tcW w:type="dxa" w:w="2200"/>
+          </w:tcPr>
+          <w:p>
+            <w:pPr>
+              <w:pStyle w:val="Compact"/>
+              <w:jc w:val="left"/>
+            </w:pPr>
+            <w:r>
+              <w:rPr>
+                <w:b w:val="0"/>
+              </w:rPr>
+              <w:t>mistral-nemo:latest</w:t>
+            </w:r>
+          </w:p>
+        </w:tc>
+        <w:tc>
+          <w:tcPr>
+            <w:tcW w:type="dxa" w:w="3319"/>
+          </w:tcPr>
+          <w:p>
+            <w:pPr>
+              <w:pStyle w:val="Compact"/>
+              <w:jc w:val="center"/>
+            </w:pPr>
+            <w:r>
+              <w:rPr>
+                <w:b w:val="0"/>
+              </w:rPr>
+              <w:t>60,39 % [59,80, 60,97]</w:t>
+            </w:r>
+          </w:p>
+        </w:tc>
+        <w:tc>
+          <w:tcPr>
+            <w:tcW w:type="dxa" w:w="3319"/>
+          </w:tcPr>
+          <w:p>
+            <w:pPr>
+              <w:pStyle w:val="Compact"/>
+              <w:jc w:val="center"/>
+            </w:pPr>
+            <w:r>
+              <w:rPr>
+                <w:b w:val="0"/>
+              </w:rPr>
+              <w:t>56,93 % [55,77, 58,10]</w:t>
+            </w:r>
+          </w:p>
+        </w:tc>
+      </w:tr>
+      <w:tr>
+        <w:tc>
+          <w:tcPr>
+            <w:tcW w:type="dxa" w:w="2200"/>
+          </w:tcPr>
+          <w:p>
+            <w:pPr>
+              <w:pStyle w:val="Compact"/>
+              <w:jc w:val="left"/>
+            </w:pPr>
+            <w:r>
+              <w:rPr>
+                <w:b w:val="0"/>
+              </w:rPr>
+              <w:t>deepseek-r1:1.5b</w:t>
+            </w:r>
+          </w:p>
+        </w:tc>
+        <w:tc>
+          <w:tcPr>
+            <w:tcW w:type="dxa" w:w="3319"/>
+          </w:tcPr>
+          <w:p>
+            <w:pPr>
+              <w:pStyle w:val="Compact"/>
+              <w:jc w:val="center"/>
+            </w:pPr>
+            <w:r>
+              <w:rPr>
+                <w:b w:val="0"/>
+              </w:rPr>
+              <w:t>29,18 % [28,13, 30,23]</w:t>
+            </w:r>
+          </w:p>
+        </w:tc>
+        <w:tc>
+          <w:tcPr>
+            <w:tcW w:type="dxa" w:w="3319"/>
+          </w:tcPr>
+          <w:p>
+            <w:pPr>
+              <w:pStyle w:val="Compact"/>
+              <w:jc w:val="center"/>
+            </w:pPr>
+            <w:r>
+              <w:rPr>
+                <w:b w:val="0"/>
+              </w:rPr>
+              <w:t>31,99 % [30,92, 33,06]</w:t>
+            </w:r>
+          </w:p>
+        </w:tc>
+      </w:tr>
+      <w:tr>
+        <w:tc>
+          <w:tcPr>
+            <w:tcW w:type="dxa" w:w="2200"/>
+          </w:tcPr>
+          <w:p>
+            <w:pPr>
+              <w:pStyle w:val="Compact"/>
+              <w:jc w:val="left"/>
+            </w:pPr>
+            <w:r>
+              <w:rPr>
+                <w:b w:val="0"/>
+              </w:rPr>
+              <w:t>nemotron-mini:4b</w:t>
+            </w:r>
+          </w:p>
+        </w:tc>
+        <w:tc>
+          <w:tcPr>
+            <w:tcW w:type="dxa" w:w="3319"/>
+          </w:tcPr>
+          <w:p>
+            <w:pPr>
+              <w:pStyle w:val="Compact"/>
+              <w:jc w:val="center"/>
+            </w:pPr>
+            <w:r>
+              <w:rPr>
+                <w:b w:val="0"/>
+              </w:rPr>
+              <w:t>27,68 % [26,90, 28,46]</w:t>
+            </w:r>
+          </w:p>
+        </w:tc>
+        <w:tc>
+          <w:tcPr>
+            <w:tcW w:type="dxa" w:w="3319"/>
+          </w:tcPr>
+          <w:p>
+            <w:pPr>
+              <w:pStyle w:val="Compact"/>
+              <w:jc w:val="center"/>
+            </w:pPr>
+            <w:r>
+              <w:rPr>
+                <w:b w:val="0"/>
+              </w:rPr>
+              <w:t>41,13 % [40,23, 42,02]</w:t>
+            </w:r>
+          </w:p>
+        </w:tc>
+      </w:tr>
+    </w:tbl>
+    <w:p>
+      <w:pPr>
+        <w:numPr>
+          <w:ilvl w:val="0"/>
+          <w:numId w:val="0"/>
+        </w:numPr>
+        <w:pStyle w:val="BodyText"/>
+      </w:pPr>
+      <w:r>
+        <w:t xml:space="preserve">De los veintidós puntos que reporta la Tabla 7 para estos once modelos (baseline y KB RAG), quince caen dentro de su intervalo de confianza de cinco semillas. Los siete restantes quedan fuera por un margen mínimo, entre 0,03 y 0,13 puntos porcentuales (gemma4:12b-mlx en ambos modos, gpt-oss:20b, llama3.1:8b, qwen3:8b, llama3.2:latest y deepseek-r1:1.5b en uno de los dos), consistente con que la corrida publicada no comparte semilla con ninguna de las cinco de esta réplica salvo, aparentemente, en gemma4:31b-mlx. El resultado de conjunto es el mismo: ningún modelo se desvía de su franja de cinco semillas más allá de un margen menor al 0,15 % absoluto, y la cifra ya publicada en la Tabla 7 queda acotada, no cuestionada, por este intervalo de confianza.</w:t>
       </w:r>
     </w:p>
     <w:sectPr>

</xml_diff>